<commit_message>
Updated project issue file
</commit_message>
<xml_diff>
--- a/proj-arch.docx
+++ b/proj-arch.docx
@@ -754,8 +754,6 @@
       <w:r>
         <w:t xml:space="preserve">│  </w:t>
       </w:r>
-      <w:bookmarkStart w:id="0" w:name="_GoBack"/>
-      <w:bookmarkEnd w:id="0"/>
     </w:p>
     <w:p>
       <w:r>
@@ -1037,6 +1035,9 @@
       <w:r>
         <w:br/>
       </w:r>
+      <w:r>
+        <w:t>platform-</w:t>
+      </w:r>
       <w:proofErr w:type="spellStart"/>
       <w:r>
         <w:t>gitops</w:t>
@@ -1048,19 +1049,24 @@
     </w:p>
     <w:p>
       <w:r>
-        <w:rPr>
-          <w:rFonts w:ascii="Arial" w:hAnsi="Arial" w:cs="Arial"/>
-        </w:rPr>
-        <w:t>├</w:t>
-      </w:r>
-      <w:r>
-        <w:rPr>
-          <w:rFonts w:ascii="Calibri" w:hAnsi="Calibri" w:cs="Calibri"/>
-        </w:rPr>
-        <w:t>──</w:t>
-      </w:r>
-      <w:r>
-        <w:t xml:space="preserve"> platform/</w:t>
+        <w:t>│</w:t>
+      </w:r>
+    </w:p>
+    <w:p>
+      <w:r>
+        <w:rPr>
+          <w:rFonts w:ascii="Arial" w:hAnsi="Arial" w:cs="Arial"/>
+        </w:rPr>
+        <w:t>├</w:t>
+      </w:r>
+      <w:r>
+        <w:rPr>
+          <w:rFonts w:ascii="Calibri" w:hAnsi="Calibri" w:cs="Calibri"/>
+        </w:rPr>
+        <w:t>──</w:t>
+      </w:r>
+      <w:r>
+        <w:t xml:space="preserve"> bootstrap/                         # Cluster bootstrap layer</w:t>
       </w:r>
     </w:p>
     <w:p>
@@ -1080,7 +1086,136 @@
         <w:t>──</w:t>
       </w:r>
       <w:r>
-        <w:t xml:space="preserve"> core/</w:t>
+        <w:t xml:space="preserve"> </w:t>
+      </w:r>
+      <w:proofErr w:type="spellStart"/>
+      <w:r>
+        <w:t>argocd</w:t>
+      </w:r>
+      <w:proofErr w:type="spellEnd"/>
+      <w:r>
+        <w:t xml:space="preserve">/                        # </w:t>
+      </w:r>
+      <w:proofErr w:type="spellStart"/>
+      <w:r>
+        <w:t>ArgoCD</w:t>
+      </w:r>
+      <w:proofErr w:type="spellEnd"/>
+      <w:r>
+        <w:t xml:space="preserve"> installation</w:t>
+      </w:r>
+    </w:p>
+    <w:p>
+      <w:r>
+        <w:t>│   └── root-applications/             # Entry points per environment</w:t>
+      </w:r>
+    </w:p>
+    <w:p>
+      <w:r>
+        <w:t xml:space="preserve">│       </w:t>
+      </w:r>
+      <w:r>
+        <w:rPr>
+          <w:rFonts w:ascii="Arial" w:hAnsi="Arial" w:cs="Arial"/>
+        </w:rPr>
+        <w:t>├</w:t>
+      </w:r>
+      <w:r>
+        <w:rPr>
+          <w:rFonts w:ascii="Calibri" w:hAnsi="Calibri" w:cs="Calibri"/>
+        </w:rPr>
+        <w:t>──</w:t>
+      </w:r>
+      <w:r>
+        <w:t xml:space="preserve"> </w:t>
+      </w:r>
+      <w:proofErr w:type="spellStart"/>
+      <w:proofErr w:type="gramStart"/>
+      <w:r>
+        <w:t>dev.yaml</w:t>
+      </w:r>
+      <w:proofErr w:type="spellEnd"/>
+      <w:proofErr w:type="gramEnd"/>
+    </w:p>
+    <w:p>
+      <w:r>
+        <w:t xml:space="preserve">│       </w:t>
+      </w:r>
+      <w:r>
+        <w:rPr>
+          <w:rFonts w:ascii="Arial" w:hAnsi="Arial" w:cs="Arial"/>
+        </w:rPr>
+        <w:t>├</w:t>
+      </w:r>
+      <w:r>
+        <w:rPr>
+          <w:rFonts w:ascii="Calibri" w:hAnsi="Calibri" w:cs="Calibri"/>
+        </w:rPr>
+        <w:t>──</w:t>
+      </w:r>
+      <w:r>
+        <w:t xml:space="preserve"> </w:t>
+      </w:r>
+      <w:proofErr w:type="spellStart"/>
+      <w:proofErr w:type="gramStart"/>
+      <w:r>
+        <w:t>stage.yaml</w:t>
+      </w:r>
+      <w:proofErr w:type="spellEnd"/>
+      <w:proofErr w:type="gramEnd"/>
+    </w:p>
+    <w:p>
+      <w:r>
+        <w:t xml:space="preserve">│       └── </w:t>
+      </w:r>
+      <w:proofErr w:type="spellStart"/>
+      <w:proofErr w:type="gramStart"/>
+      <w:r>
+        <w:t>prod.yaml</w:t>
+      </w:r>
+      <w:proofErr w:type="spellEnd"/>
+      <w:proofErr w:type="gramEnd"/>
+    </w:p>
+    <w:p>
+      <w:r>
+        <w:t>│</w:t>
+      </w:r>
+    </w:p>
+    <w:p>
+      <w:r>
+        <w:rPr>
+          <w:rFonts w:ascii="Arial" w:hAnsi="Arial" w:cs="Arial"/>
+        </w:rPr>
+        <w:t>├</w:t>
+      </w:r>
+      <w:r>
+        <w:rPr>
+          <w:rFonts w:ascii="Calibri" w:hAnsi="Calibri" w:cs="Calibri"/>
+        </w:rPr>
+        <w:t>──</w:t>
+      </w:r>
+      <w:r>
+        <w:t xml:space="preserve"> platform/                          # Cluster-level capabilities</w:t>
+      </w:r>
+    </w:p>
+    <w:p>
+      <w:r>
+        <w:t xml:space="preserve">│   </w:t>
+      </w:r>
+      <w:r>
+        <w:rPr>
+          <w:rFonts w:ascii="Arial" w:hAnsi="Arial" w:cs="Arial"/>
+        </w:rPr>
+        <w:t>├</w:t>
+      </w:r>
+      <w:r>
+        <w:rPr>
+          <w:rFonts w:ascii="Calibri" w:hAnsi="Calibri" w:cs="Calibri"/>
+        </w:rPr>
+        <w:t>──</w:t>
+      </w:r>
+      <w:r>
+        <w:t xml:space="preserve"> operators/</w:t>
       </w:r>
     </w:p>
     <w:p>
@@ -1100,6 +1235,1066 @@
         <w:t>──</w:t>
       </w:r>
       <w:r>
+        <w:t xml:space="preserve"> external-secrets/</w:t>
+      </w:r>
+    </w:p>
+    <w:p>
+      <w:r>
+        <w:t xml:space="preserve">│   │   </w:t>
+      </w:r>
+      <w:r>
+        <w:rPr>
+          <w:rFonts w:ascii="Arial" w:hAnsi="Arial" w:cs="Arial"/>
+        </w:rPr>
+        <w:t>├</w:t>
+      </w:r>
+      <w:r>
+        <w:rPr>
+          <w:rFonts w:ascii="Calibri" w:hAnsi="Calibri" w:cs="Calibri"/>
+        </w:rPr>
+        <w:t>──</w:t>
+      </w:r>
+      <w:r>
+        <w:t xml:space="preserve"> cert-manager/</w:t>
+      </w:r>
+    </w:p>
+    <w:p>
+      <w:r>
+        <w:t xml:space="preserve">│   │   </w:t>
+      </w:r>
+      <w:r>
+        <w:rPr>
+          <w:rFonts w:ascii="Arial" w:hAnsi="Arial" w:cs="Arial"/>
+        </w:rPr>
+        <w:t>├</w:t>
+      </w:r>
+      <w:r>
+        <w:rPr>
+          <w:rFonts w:ascii="Calibri" w:hAnsi="Calibri" w:cs="Calibri"/>
+        </w:rPr>
+        <w:t>──</w:t>
+      </w:r>
+      <w:r>
+        <w:t xml:space="preserve"> </w:t>
+      </w:r>
+      <w:proofErr w:type="spellStart"/>
+      <w:r>
+        <w:t>kyverno</w:t>
+      </w:r>
+      <w:proofErr w:type="spellEnd"/>
+      <w:r>
+        <w:t>/</w:t>
+      </w:r>
+    </w:p>
+    <w:p>
+      <w:r>
+        <w:t xml:space="preserve">│   │   </w:t>
+      </w:r>
+      <w:r>
+        <w:rPr>
+          <w:rFonts w:ascii="Arial" w:hAnsi="Arial" w:cs="Arial"/>
+        </w:rPr>
+        <w:t>├</w:t>
+      </w:r>
+      <w:r>
+        <w:rPr>
+          <w:rFonts w:ascii="Calibri" w:hAnsi="Calibri" w:cs="Calibri"/>
+        </w:rPr>
+        <w:t>──</w:t>
+      </w:r>
+      <w:r>
+        <w:t xml:space="preserve"> </w:t>
+      </w:r>
+      <w:proofErr w:type="spellStart"/>
+      <w:r>
+        <w:t>istio</w:t>
+      </w:r>
+      <w:proofErr w:type="spellEnd"/>
+      <w:r>
+        <w:t>/</w:t>
+      </w:r>
+    </w:p>
+    <w:p>
+      <w:r>
+        <w:t xml:space="preserve">│   │   └── </w:t>
+      </w:r>
+      <w:proofErr w:type="spellStart"/>
+      <w:r>
+        <w:t>postgres</w:t>
+      </w:r>
+      <w:proofErr w:type="spellEnd"/>
+      <w:r>
+        <w:t>-operator/         # used only in dev</w:t>
+      </w:r>
+    </w:p>
+    <w:p>
+      <w:r>
+        <w:t>│   │</w:t>
+      </w:r>
+    </w:p>
+    <w:p>
+      <w:r>
+        <w:t xml:space="preserve">│   </w:t>
+      </w:r>
+      <w:r>
+        <w:rPr>
+          <w:rFonts w:ascii="Arial" w:hAnsi="Arial" w:cs="Arial"/>
+        </w:rPr>
+        <w:t>├</w:t>
+      </w:r>
+      <w:r>
+        <w:rPr>
+          <w:rFonts w:ascii="Calibri" w:hAnsi="Calibri" w:cs="Calibri"/>
+        </w:rPr>
+        <w:t>──</w:t>
+      </w:r>
+      <w:r>
+        <w:t xml:space="preserve"> security/</w:t>
+      </w:r>
+    </w:p>
+    <w:p>
+      <w:r>
+        <w:t xml:space="preserve">│   │   </w:t>
+      </w:r>
+      <w:r>
+        <w:rPr>
+          <w:rFonts w:ascii="Arial" w:hAnsi="Arial" w:cs="Arial"/>
+        </w:rPr>
+        <w:t>├</w:t>
+      </w:r>
+      <w:r>
+        <w:rPr>
+          <w:rFonts w:ascii="Calibri" w:hAnsi="Calibri" w:cs="Calibri"/>
+        </w:rPr>
+        <w:t>──</w:t>
+      </w:r>
+      <w:r>
+        <w:t xml:space="preserve"> network-policies/</w:t>
+      </w:r>
+    </w:p>
+    <w:p>
+      <w:r>
+        <w:t xml:space="preserve">│   │   </w:t>
+      </w:r>
+      <w:r>
+        <w:rPr>
+          <w:rFonts w:ascii="Arial" w:hAnsi="Arial" w:cs="Arial"/>
+        </w:rPr>
+        <w:t>├</w:t>
+      </w:r>
+      <w:r>
+        <w:rPr>
+          <w:rFonts w:ascii="Calibri" w:hAnsi="Calibri" w:cs="Calibri"/>
+        </w:rPr>
+        <w:t>──</w:t>
+      </w:r>
+      <w:r>
+        <w:t xml:space="preserve"> pod-security/</w:t>
+      </w:r>
+    </w:p>
+    <w:p>
+      <w:r>
+        <w:t xml:space="preserve">│   │   └── </w:t>
+      </w:r>
+      <w:proofErr w:type="spellStart"/>
+      <w:r>
+        <w:t>falco</w:t>
+      </w:r>
+      <w:proofErr w:type="spellEnd"/>
+      <w:r>
+        <w:t>/</w:t>
+      </w:r>
+    </w:p>
+    <w:p>
+      <w:r>
+        <w:t>│   │</w:t>
+      </w:r>
+    </w:p>
+    <w:p>
+      <w:r>
+        <w:t xml:space="preserve">│   </w:t>
+      </w:r>
+      <w:r>
+        <w:rPr>
+          <w:rFonts w:ascii="Arial" w:hAnsi="Arial" w:cs="Arial"/>
+        </w:rPr>
+        <w:t>├</w:t>
+      </w:r>
+      <w:r>
+        <w:rPr>
+          <w:rFonts w:ascii="Calibri" w:hAnsi="Calibri" w:cs="Calibri"/>
+        </w:rPr>
+        <w:t>──</w:t>
+      </w:r>
+      <w:r>
+        <w:t xml:space="preserve"> networking/</w:t>
+      </w:r>
+    </w:p>
+    <w:p>
+      <w:r>
+        <w:t xml:space="preserve">│   │   </w:t>
+      </w:r>
+      <w:r>
+        <w:rPr>
+          <w:rFonts w:ascii="Arial" w:hAnsi="Arial" w:cs="Arial"/>
+        </w:rPr>
+        <w:t>├</w:t>
+      </w:r>
+      <w:r>
+        <w:rPr>
+          <w:rFonts w:ascii="Calibri" w:hAnsi="Calibri" w:cs="Calibri"/>
+        </w:rPr>
+        <w:t>──</w:t>
+      </w:r>
+      <w:r>
+        <w:t xml:space="preserve"> ingress/</w:t>
+      </w:r>
+    </w:p>
+    <w:p>
+      <w:r>
+        <w:t xml:space="preserve">│   │   </w:t>
+      </w:r>
+      <w:r>
+        <w:rPr>
+          <w:rFonts w:ascii="Arial" w:hAnsi="Arial" w:cs="Arial"/>
+        </w:rPr>
+        <w:t>├</w:t>
+      </w:r>
+      <w:r>
+        <w:rPr>
+          <w:rFonts w:ascii="Calibri" w:hAnsi="Calibri" w:cs="Calibri"/>
+        </w:rPr>
+        <w:t>──</w:t>
+      </w:r>
+      <w:r>
+        <w:t xml:space="preserve"> gateways/</w:t>
+      </w:r>
+    </w:p>
+    <w:p>
+      <w:r>
+        <w:t>│   │   └── service-mesh/</w:t>
+      </w:r>
+    </w:p>
+    <w:p>
+      <w:r>
+        <w:t>│   │</w:t>
+      </w:r>
+    </w:p>
+    <w:p>
+      <w:r>
+        <w:t xml:space="preserve">│   </w:t>
+      </w:r>
+      <w:r>
+        <w:rPr>
+          <w:rFonts w:ascii="Arial" w:hAnsi="Arial" w:cs="Arial"/>
+        </w:rPr>
+        <w:t>├</w:t>
+      </w:r>
+      <w:r>
+        <w:rPr>
+          <w:rFonts w:ascii="Calibri" w:hAnsi="Calibri" w:cs="Calibri"/>
+        </w:rPr>
+        <w:t>──</w:t>
+      </w:r>
+      <w:r>
+        <w:t xml:space="preserve"> observability/</w:t>
+      </w:r>
+    </w:p>
+    <w:p>
+      <w:r>
+        <w:lastRenderedPageBreak/>
+        <w:t xml:space="preserve">│   │   </w:t>
+      </w:r>
+      <w:r>
+        <w:rPr>
+          <w:rFonts w:ascii="Arial" w:hAnsi="Arial" w:cs="Arial"/>
+        </w:rPr>
+        <w:t>├</w:t>
+      </w:r>
+      <w:r>
+        <w:rPr>
+          <w:rFonts w:ascii="Calibri" w:hAnsi="Calibri" w:cs="Calibri"/>
+        </w:rPr>
+        <w:t>──</w:t>
+      </w:r>
+      <w:r>
+        <w:t xml:space="preserve"> </w:t>
+      </w:r>
+      <w:proofErr w:type="spellStart"/>
+      <w:r>
+        <w:t>prometheus</w:t>
+      </w:r>
+      <w:proofErr w:type="spellEnd"/>
+      <w:r>
+        <w:t>/</w:t>
+      </w:r>
+    </w:p>
+    <w:p>
+      <w:r>
+        <w:t xml:space="preserve">│   │   </w:t>
+      </w:r>
+      <w:r>
+        <w:rPr>
+          <w:rFonts w:ascii="Arial" w:hAnsi="Arial" w:cs="Arial"/>
+        </w:rPr>
+        <w:t>├</w:t>
+      </w:r>
+      <w:r>
+        <w:rPr>
+          <w:rFonts w:ascii="Calibri" w:hAnsi="Calibri" w:cs="Calibri"/>
+        </w:rPr>
+        <w:t>──</w:t>
+      </w:r>
+      <w:r>
+        <w:t xml:space="preserve"> </w:t>
+      </w:r>
+      <w:proofErr w:type="spellStart"/>
+      <w:r>
+        <w:t>grafana</w:t>
+      </w:r>
+      <w:proofErr w:type="spellEnd"/>
+      <w:r>
+        <w:t>/</w:t>
+      </w:r>
+    </w:p>
+    <w:p>
+      <w:r>
+        <w:t xml:space="preserve">│   │   └── </w:t>
+      </w:r>
+      <w:proofErr w:type="spellStart"/>
+      <w:r>
+        <w:t>loki</w:t>
+      </w:r>
+      <w:proofErr w:type="spellEnd"/>
+      <w:r>
+        <w:t>/</w:t>
+      </w:r>
+    </w:p>
+    <w:p>
+      <w:r>
+        <w:t>│   │</w:t>
+      </w:r>
+    </w:p>
+    <w:p>
+      <w:r>
+        <w:t>│   └── shared-services/</w:t>
+      </w:r>
+    </w:p>
+    <w:p>
+      <w:r>
+        <w:t xml:space="preserve">│       </w:t>
+      </w:r>
+      <w:r>
+        <w:rPr>
+          <w:rFonts w:ascii="Arial" w:hAnsi="Arial" w:cs="Arial"/>
+        </w:rPr>
+        <w:t>├</w:t>
+      </w:r>
+      <w:r>
+        <w:rPr>
+          <w:rFonts w:ascii="Calibri" w:hAnsi="Calibri" w:cs="Calibri"/>
+        </w:rPr>
+        <w:t>──</w:t>
+      </w:r>
+      <w:r>
+        <w:t xml:space="preserve"> </w:t>
+      </w:r>
+      <w:proofErr w:type="spellStart"/>
+      <w:r>
+        <w:t>redis</w:t>
+      </w:r>
+      <w:proofErr w:type="spellEnd"/>
+      <w:r>
+        <w:t>/</w:t>
+      </w:r>
+    </w:p>
+    <w:p>
+      <w:r>
+        <w:t xml:space="preserve">│       └── </w:t>
+      </w:r>
+      <w:proofErr w:type="spellStart"/>
+      <w:r>
+        <w:t>kafka</w:t>
+      </w:r>
+      <w:proofErr w:type="spellEnd"/>
+      <w:r>
+        <w:t>/</w:t>
+      </w:r>
+    </w:p>
+    <w:p>
+      <w:r>
+        <w:t>│</w:t>
+      </w:r>
+    </w:p>
+    <w:p>
+      <w:r>
+        <w:rPr>
+          <w:rFonts w:ascii="Arial" w:hAnsi="Arial" w:cs="Arial"/>
+        </w:rPr>
+        <w:t>├</w:t>
+      </w:r>
+      <w:r>
+        <w:rPr>
+          <w:rFonts w:ascii="Calibri" w:hAnsi="Calibri" w:cs="Calibri"/>
+        </w:rPr>
+        <w:t>──</w:t>
+      </w:r>
+      <w:r>
+        <w:t xml:space="preserve"> infrastructure/                    # </w:t>
+      </w:r>
+      <w:proofErr w:type="spellStart"/>
+      <w:r>
+        <w:t>Crossplane</w:t>
+      </w:r>
+      <w:proofErr w:type="spellEnd"/>
+      <w:r>
+        <w:t xml:space="preserve"> layer (future replacement for TF)</w:t>
+      </w:r>
+    </w:p>
+    <w:p>
+      <w:r>
+        <w:t xml:space="preserve">│   └── </w:t>
+      </w:r>
+      <w:proofErr w:type="spellStart"/>
+      <w:r>
+        <w:t>crossplane</w:t>
+      </w:r>
+      <w:proofErr w:type="spellEnd"/>
+      <w:r>
+        <w:t>/</w:t>
+      </w:r>
+    </w:p>
+    <w:p>
+      <w:r>
+        <w:t xml:space="preserve">│       </w:t>
+      </w:r>
+      <w:r>
+        <w:rPr>
+          <w:rFonts w:ascii="Arial" w:hAnsi="Arial" w:cs="Arial"/>
+        </w:rPr>
+        <w:t>├</w:t>
+      </w:r>
+      <w:r>
+        <w:rPr>
+          <w:rFonts w:ascii="Calibri" w:hAnsi="Calibri" w:cs="Calibri"/>
+        </w:rPr>
+        <w:t>──</w:t>
+      </w:r>
+      <w:r>
+        <w:t xml:space="preserve"> providers/</w:t>
+      </w:r>
+    </w:p>
+    <w:p>
+      <w:r>
+        <w:t xml:space="preserve">│       │   └── </w:t>
+      </w:r>
+      <w:proofErr w:type="spellStart"/>
+      <w:r>
+        <w:t>aws</w:t>
+      </w:r>
+      <w:proofErr w:type="spellEnd"/>
+      <w:r>
+        <w:t>/</w:t>
+      </w:r>
+    </w:p>
+    <w:p>
+      <w:r>
+        <w:t>│       │</w:t>
+      </w:r>
+    </w:p>
+    <w:p>
+      <w:r>
+        <w:t xml:space="preserve">│       </w:t>
+      </w:r>
+      <w:r>
+        <w:rPr>
+          <w:rFonts w:ascii="Arial" w:hAnsi="Arial" w:cs="Arial"/>
+        </w:rPr>
+        <w:t>├</w:t>
+      </w:r>
+      <w:r>
+        <w:rPr>
+          <w:rFonts w:ascii="Calibri" w:hAnsi="Calibri" w:cs="Calibri"/>
+        </w:rPr>
+        <w:t>──</w:t>
+      </w:r>
+      <w:r>
+        <w:t xml:space="preserve"> compositions/              # Platform APIs</w:t>
+      </w:r>
+    </w:p>
+    <w:p>
+      <w:r>
+        <w:t xml:space="preserve">│       │   </w:t>
+      </w:r>
+      <w:r>
+        <w:rPr>
+          <w:rFonts w:ascii="Arial" w:hAnsi="Arial" w:cs="Arial"/>
+        </w:rPr>
+        <w:t>├</w:t>
+      </w:r>
+      <w:r>
+        <w:rPr>
+          <w:rFonts w:ascii="Calibri" w:hAnsi="Calibri" w:cs="Calibri"/>
+        </w:rPr>
+        <w:t>──</w:t>
+      </w:r>
+      <w:r>
+        <w:t xml:space="preserve"> database/</w:t>
+      </w:r>
+    </w:p>
+    <w:p>
+      <w:r>
+        <w:t xml:space="preserve">│       │   </w:t>
+      </w:r>
+      <w:r>
+        <w:rPr>
+          <w:rFonts w:ascii="Arial" w:hAnsi="Arial" w:cs="Arial"/>
+        </w:rPr>
+        <w:t>├</w:t>
+      </w:r>
+      <w:r>
+        <w:rPr>
+          <w:rFonts w:ascii="Calibri" w:hAnsi="Calibri" w:cs="Calibri"/>
+        </w:rPr>
+        <w:t>──</w:t>
+      </w:r>
+      <w:r>
+        <w:t xml:space="preserve"> network/</w:t>
+      </w:r>
+    </w:p>
+    <w:p>
+      <w:r>
+        <w:t xml:space="preserve">│       │   └── </w:t>
+      </w:r>
+      <w:proofErr w:type="spellStart"/>
+      <w:r>
+        <w:t>iam</w:t>
+      </w:r>
+      <w:proofErr w:type="spellEnd"/>
+      <w:r>
+        <w:t>/</w:t>
+      </w:r>
+    </w:p>
+    <w:p>
+      <w:r>
+        <w:t>│       │</w:t>
+      </w:r>
+    </w:p>
+    <w:p>
+      <w:r>
+        <w:t xml:space="preserve">│       └── claims/                    # </w:t>
+      </w:r>
+      <w:proofErr w:type="spellStart"/>
+      <w:r>
+        <w:t>Env</w:t>
+      </w:r>
+      <w:proofErr w:type="spellEnd"/>
+      <w:r>
+        <w:t>-specific usage</w:t>
+      </w:r>
+    </w:p>
+    <w:p>
+      <w:r>
+        <w:t xml:space="preserve">│           </w:t>
+      </w:r>
+      <w:r>
+        <w:rPr>
+          <w:rFonts w:ascii="Arial" w:hAnsi="Arial" w:cs="Arial"/>
+        </w:rPr>
+        <w:t>├</w:t>
+      </w:r>
+      <w:r>
+        <w:rPr>
+          <w:rFonts w:ascii="Calibri" w:hAnsi="Calibri" w:cs="Calibri"/>
+        </w:rPr>
+        <w:t>──</w:t>
+      </w:r>
+      <w:r>
+        <w:t xml:space="preserve"> dev/</w:t>
+      </w:r>
+    </w:p>
+    <w:p>
+      <w:r>
+        <w:t xml:space="preserve">│           </w:t>
+      </w:r>
+      <w:r>
+        <w:rPr>
+          <w:rFonts w:ascii="Arial" w:hAnsi="Arial" w:cs="Arial"/>
+        </w:rPr>
+        <w:t>├</w:t>
+      </w:r>
+      <w:r>
+        <w:rPr>
+          <w:rFonts w:ascii="Calibri" w:hAnsi="Calibri" w:cs="Calibri"/>
+        </w:rPr>
+        <w:t>──</w:t>
+      </w:r>
+      <w:r>
+        <w:t xml:space="preserve"> stage/</w:t>
+      </w:r>
+    </w:p>
+    <w:p>
+      <w:r>
+        <w:t>│           └── prod/</w:t>
+      </w:r>
+    </w:p>
+    <w:p>
+      <w:r>
+        <w:t>│</w:t>
+      </w:r>
+    </w:p>
+    <w:p>
+      <w:r>
+        <w:rPr>
+          <w:rFonts w:ascii="Arial" w:hAnsi="Arial" w:cs="Arial"/>
+        </w:rPr>
+        <w:t>├</w:t>
+      </w:r>
+      <w:r>
+        <w:rPr>
+          <w:rFonts w:ascii="Calibri" w:hAnsi="Calibri" w:cs="Calibri"/>
+        </w:rPr>
+        <w:t>──</w:t>
+      </w:r>
+      <w:r>
+        <w:t xml:space="preserve"> environments/                      # </w:t>
+      </w:r>
+      <w:r>
+        <w:rPr>
+          <w:rFonts w:ascii="Segoe UI Symbol" w:hAnsi="Segoe UI Symbol" w:cs="Segoe UI Symbol"/>
+        </w:rPr>
+        <w:t>🔥</w:t>
+      </w:r>
+      <w:r>
+        <w:t xml:space="preserve"> Composition layer (MOST IMPORTANT)</w:t>
+      </w:r>
+    </w:p>
+    <w:p>
+      <w:r>
+        <w:t xml:space="preserve">│   </w:t>
+      </w:r>
+      <w:r>
+        <w:rPr>
+          <w:rFonts w:ascii="Arial" w:hAnsi="Arial" w:cs="Arial"/>
+        </w:rPr>
+        <w:t>├</w:t>
+      </w:r>
+      <w:r>
+        <w:rPr>
+          <w:rFonts w:ascii="Calibri" w:hAnsi="Calibri" w:cs="Calibri"/>
+        </w:rPr>
+        <w:t>──</w:t>
+      </w:r>
+      <w:r>
+        <w:t xml:space="preserve"> dev/</w:t>
+      </w:r>
+    </w:p>
+    <w:p>
+      <w:r>
+        <w:t xml:space="preserve">│   │   </w:t>
+      </w:r>
+      <w:r>
+        <w:rPr>
+          <w:rFonts w:ascii="Arial" w:hAnsi="Arial" w:cs="Arial"/>
+        </w:rPr>
+        <w:t>├</w:t>
+      </w:r>
+      <w:r>
+        <w:rPr>
+          <w:rFonts w:ascii="Calibri" w:hAnsi="Calibri" w:cs="Calibri"/>
+        </w:rPr>
+        <w:t>──</w:t>
+      </w:r>
+      <w:r>
+        <w:t xml:space="preserve"> </w:t>
+      </w:r>
+      <w:proofErr w:type="spellStart"/>
+      <w:proofErr w:type="gramStart"/>
+      <w:r>
+        <w:t>platform.yaml</w:t>
+      </w:r>
+      <w:proofErr w:type="spellEnd"/>
+      <w:proofErr w:type="gramEnd"/>
+      <w:r>
+        <w:t xml:space="preserve">              # installs platform components</w:t>
+      </w:r>
+    </w:p>
+    <w:p>
+      <w:r>
+        <w:t xml:space="preserve">│   │   </w:t>
+      </w:r>
+      <w:r>
+        <w:rPr>
+          <w:rFonts w:ascii="Arial" w:hAnsi="Arial" w:cs="Arial"/>
+        </w:rPr>
+        <w:t>├</w:t>
+      </w:r>
+      <w:r>
+        <w:rPr>
+          <w:rFonts w:ascii="Calibri" w:hAnsi="Calibri" w:cs="Calibri"/>
+        </w:rPr>
+        <w:t>──</w:t>
+      </w:r>
+      <w:r>
+        <w:t xml:space="preserve"> </w:t>
+      </w:r>
+      <w:proofErr w:type="spellStart"/>
+      <w:proofErr w:type="gramStart"/>
+      <w:r>
+        <w:t>infrastructure.yaml</w:t>
+      </w:r>
+      <w:proofErr w:type="spellEnd"/>
+      <w:proofErr w:type="gramEnd"/>
+      <w:r>
+        <w:t xml:space="preserve">        # </w:t>
+      </w:r>
+      <w:proofErr w:type="spellStart"/>
+      <w:r>
+        <w:t>crossplane</w:t>
+      </w:r>
+      <w:proofErr w:type="spellEnd"/>
+      <w:r>
+        <w:t xml:space="preserve"> claims</w:t>
+      </w:r>
+    </w:p>
+    <w:p>
+      <w:r>
+        <w:t xml:space="preserve">│   │   └── </w:t>
+      </w:r>
+      <w:proofErr w:type="spellStart"/>
+      <w:proofErr w:type="gramStart"/>
+      <w:r>
+        <w:t>applications.yaml</w:t>
+      </w:r>
+      <w:proofErr w:type="spellEnd"/>
+      <w:proofErr w:type="gramEnd"/>
+      <w:r>
+        <w:t xml:space="preserve">          # references app repos</w:t>
+      </w:r>
+    </w:p>
+    <w:p>
+      <w:r>
+        <w:t>│   │</w:t>
+      </w:r>
+    </w:p>
+    <w:p>
+      <w:r>
+        <w:t xml:space="preserve">│   </w:t>
+      </w:r>
+      <w:r>
+        <w:rPr>
+          <w:rFonts w:ascii="Arial" w:hAnsi="Arial" w:cs="Arial"/>
+        </w:rPr>
+        <w:t>├</w:t>
+      </w:r>
+      <w:r>
+        <w:rPr>
+          <w:rFonts w:ascii="Calibri" w:hAnsi="Calibri" w:cs="Calibri"/>
+        </w:rPr>
+        <w:t>──</w:t>
+      </w:r>
+      <w:r>
+        <w:t xml:space="preserve"> stage/</w:t>
+      </w:r>
+    </w:p>
+    <w:p>
+      <w:r>
+        <w:t xml:space="preserve">│   │   </w:t>
+      </w:r>
+      <w:r>
+        <w:rPr>
+          <w:rFonts w:ascii="Arial" w:hAnsi="Arial" w:cs="Arial"/>
+        </w:rPr>
+        <w:t>├</w:t>
+      </w:r>
+      <w:r>
+        <w:rPr>
+          <w:rFonts w:ascii="Calibri" w:hAnsi="Calibri" w:cs="Calibri"/>
+        </w:rPr>
+        <w:t>──</w:t>
+      </w:r>
+      <w:r>
+        <w:t xml:space="preserve"> </w:t>
+      </w:r>
+      <w:proofErr w:type="spellStart"/>
+      <w:proofErr w:type="gramStart"/>
+      <w:r>
+        <w:t>platform.yaml</w:t>
+      </w:r>
+      <w:proofErr w:type="spellEnd"/>
+      <w:proofErr w:type="gramEnd"/>
+    </w:p>
+    <w:p>
+      <w:r>
+        <w:lastRenderedPageBreak/>
+        <w:t xml:space="preserve">│   │   </w:t>
+      </w:r>
+      <w:r>
+        <w:rPr>
+          <w:rFonts w:ascii="Arial" w:hAnsi="Arial" w:cs="Arial"/>
+        </w:rPr>
+        <w:t>├</w:t>
+      </w:r>
+      <w:r>
+        <w:rPr>
+          <w:rFonts w:ascii="Calibri" w:hAnsi="Calibri" w:cs="Calibri"/>
+        </w:rPr>
+        <w:t>──</w:t>
+      </w:r>
+      <w:r>
+        <w:t xml:space="preserve"> </w:t>
+      </w:r>
+      <w:proofErr w:type="spellStart"/>
+      <w:proofErr w:type="gramStart"/>
+      <w:r>
+        <w:t>infrastructure.yaml</w:t>
+      </w:r>
+      <w:proofErr w:type="spellEnd"/>
+      <w:proofErr w:type="gramEnd"/>
+    </w:p>
+    <w:p>
+      <w:r>
+        <w:t xml:space="preserve">│   │   └── </w:t>
+      </w:r>
+      <w:proofErr w:type="spellStart"/>
+      <w:proofErr w:type="gramStart"/>
+      <w:r>
+        <w:t>applications.yaml</w:t>
+      </w:r>
+      <w:proofErr w:type="spellEnd"/>
+      <w:proofErr w:type="gramEnd"/>
+    </w:p>
+    <w:p>
+      <w:r>
+        <w:t>│   │</w:t>
+      </w:r>
+    </w:p>
+    <w:p>
+      <w:r>
+        <w:t>│   └── prod/</w:t>
+      </w:r>
+    </w:p>
+    <w:p>
+      <w:r>
+        <w:t xml:space="preserve">│       </w:t>
+      </w:r>
+      <w:r>
+        <w:rPr>
+          <w:rFonts w:ascii="Arial" w:hAnsi="Arial" w:cs="Arial"/>
+        </w:rPr>
+        <w:t>├</w:t>
+      </w:r>
+      <w:r>
+        <w:rPr>
+          <w:rFonts w:ascii="Calibri" w:hAnsi="Calibri" w:cs="Calibri"/>
+        </w:rPr>
+        <w:t>──</w:t>
+      </w:r>
+      <w:r>
+        <w:t xml:space="preserve"> </w:t>
+      </w:r>
+      <w:proofErr w:type="spellStart"/>
+      <w:proofErr w:type="gramStart"/>
+      <w:r>
+        <w:t>platform.yaml</w:t>
+      </w:r>
+      <w:proofErr w:type="spellEnd"/>
+      <w:proofErr w:type="gramEnd"/>
+    </w:p>
+    <w:p>
+      <w:r>
+        <w:t xml:space="preserve">│       </w:t>
+      </w:r>
+      <w:r>
+        <w:rPr>
+          <w:rFonts w:ascii="Arial" w:hAnsi="Arial" w:cs="Arial"/>
+        </w:rPr>
+        <w:t>├</w:t>
+      </w:r>
+      <w:r>
+        <w:rPr>
+          <w:rFonts w:ascii="Calibri" w:hAnsi="Calibri" w:cs="Calibri"/>
+        </w:rPr>
+        <w:t>──</w:t>
+      </w:r>
+      <w:r>
+        <w:t xml:space="preserve"> </w:t>
+      </w:r>
+      <w:proofErr w:type="spellStart"/>
+      <w:proofErr w:type="gramStart"/>
+      <w:r>
+        <w:t>infrastructure.yaml</w:t>
+      </w:r>
+      <w:proofErr w:type="spellEnd"/>
+      <w:proofErr w:type="gramEnd"/>
+    </w:p>
+    <w:p>
+      <w:r>
+        <w:t xml:space="preserve">│       └── </w:t>
+      </w:r>
+      <w:proofErr w:type="spellStart"/>
+      <w:proofErr w:type="gramStart"/>
+      <w:r>
+        <w:t>applications.yaml</w:t>
+      </w:r>
+      <w:proofErr w:type="spellEnd"/>
+      <w:proofErr w:type="gramEnd"/>
+    </w:p>
+    <w:p>
+      <w:r>
+        <w:t>│</w:t>
+      </w:r>
+    </w:p>
+    <w:p>
+      <w:r>
+        <w:rPr>
+          <w:rFonts w:ascii="Arial" w:hAnsi="Arial" w:cs="Arial"/>
+        </w:rPr>
+        <w:t>├</w:t>
+      </w:r>
+      <w:r>
+        <w:rPr>
+          <w:rFonts w:ascii="Calibri" w:hAnsi="Calibri" w:cs="Calibri"/>
+        </w:rPr>
+        <w:t>──</w:t>
+      </w:r>
+      <w:r>
+        <w:t xml:space="preserve"> patterns/                          # </w:t>
+      </w:r>
+      <w:r>
+        <w:rPr>
+          <w:rFonts w:ascii="Segoe UI Symbol" w:hAnsi="Segoe UI Symbol" w:cs="Segoe UI Symbol"/>
+        </w:rPr>
+        <w:t>🔥</w:t>
+      </w:r>
+      <w:r>
+        <w:t xml:space="preserve"> Reusable deployment patterns (Backstage ready)</w:t>
+      </w:r>
+    </w:p>
+    <w:p>
+      <w:r>
+        <w:t xml:space="preserve">│   </w:t>
+      </w:r>
+      <w:r>
+        <w:rPr>
+          <w:rFonts w:ascii="Arial" w:hAnsi="Arial" w:cs="Arial"/>
+        </w:rPr>
+        <w:t>├</w:t>
+      </w:r>
+      <w:r>
+        <w:rPr>
+          <w:rFonts w:ascii="Calibri" w:hAnsi="Calibri" w:cs="Calibri"/>
+        </w:rPr>
+        <w:t>──</w:t>
+      </w:r>
+      <w:r>
+        <w:t xml:space="preserve"> </w:t>
+      </w:r>
+      <w:proofErr w:type="spellStart"/>
+      <w:r>
+        <w:t>microservice</w:t>
+      </w:r>
+      <w:proofErr w:type="spellEnd"/>
+      <w:r>
+        <w:t>/</w:t>
+      </w:r>
+    </w:p>
+    <w:p>
+      <w:r>
+        <w:t xml:space="preserve">│   │   </w:t>
+      </w:r>
+      <w:r>
+        <w:rPr>
+          <w:rFonts w:ascii="Arial" w:hAnsi="Arial" w:cs="Arial"/>
+        </w:rPr>
+        <w:t>├</w:t>
+      </w:r>
+      <w:r>
+        <w:rPr>
+          <w:rFonts w:ascii="Calibri" w:hAnsi="Calibri" w:cs="Calibri"/>
+        </w:rPr>
+        <w:t>──</w:t>
+      </w:r>
+      <w:r>
+        <w:t xml:space="preserve"> app-of-</w:t>
+      </w:r>
+      <w:proofErr w:type="spellStart"/>
+      <w:proofErr w:type="gramStart"/>
+      <w:r>
+        <w:t>apps.yaml</w:t>
+      </w:r>
+      <w:proofErr w:type="spellEnd"/>
+      <w:proofErr w:type="gramEnd"/>
+    </w:p>
+    <w:p>
+      <w:r>
+        <w:t>│   │   └── values-</w:t>
+      </w:r>
+      <w:proofErr w:type="spellStart"/>
+      <w:proofErr w:type="gramStart"/>
+      <w:r>
+        <w:t>template.yaml</w:t>
+      </w:r>
+      <w:proofErr w:type="spellEnd"/>
+      <w:proofErr w:type="gramEnd"/>
+    </w:p>
+    <w:p>
+      <w:r>
+        <w:t>│   │</w:t>
+      </w:r>
+    </w:p>
+    <w:p>
+      <w:r>
+        <w:t xml:space="preserve">│   </w:t>
+      </w:r>
+      <w:r>
+        <w:rPr>
+          <w:rFonts w:ascii="Arial" w:hAnsi="Arial" w:cs="Arial"/>
+        </w:rPr>
+        <w:t>├</w:t>
+      </w:r>
+      <w:r>
+        <w:rPr>
+          <w:rFonts w:ascii="Calibri" w:hAnsi="Calibri" w:cs="Calibri"/>
+        </w:rPr>
+        <w:t>──</w:t>
+      </w:r>
+      <w:r>
+        <w:t xml:space="preserve"> backend-with-</w:t>
+      </w:r>
+      <w:proofErr w:type="spellStart"/>
+      <w:r>
+        <w:t>db</w:t>
+      </w:r>
+      <w:proofErr w:type="spellEnd"/>
+      <w:r>
+        <w:t>/</w:t>
+      </w:r>
+    </w:p>
+    <w:p>
+      <w:r>
+        <w:t>│   └── event-driven/</w:t>
+      </w:r>
+    </w:p>
+    <w:p>
+      <w:r>
+        <w:t>│</w:t>
+      </w:r>
+    </w:p>
+    <w:p>
+      <w:r>
+        <w:rPr>
+          <w:rFonts w:ascii="Arial" w:hAnsi="Arial" w:cs="Arial"/>
+        </w:rPr>
+        <w:t>├</w:t>
+      </w:r>
+      <w:r>
+        <w:rPr>
+          <w:rFonts w:ascii="Calibri" w:hAnsi="Calibri" w:cs="Calibri"/>
+        </w:rPr>
+        <w:t>──</w:t>
+      </w:r>
+      <w:r>
         <w:t xml:space="preserve"> </w:t>
       </w:r>
       <w:proofErr w:type="spellStart"/>
@@ -1108,52 +2303,7 @@
       </w:r>
       <w:proofErr w:type="spellEnd"/>
       <w:r>
-        <w:t>/</w:t>
-      </w:r>
-    </w:p>
-    <w:p>
-      <w:r>
-        <w:t xml:space="preserve">│   │   </w:t>
-      </w:r>
-      <w:r>
-        <w:rPr>
-          <w:rFonts w:ascii="Arial" w:hAnsi="Arial" w:cs="Arial"/>
-        </w:rPr>
-        <w:t>├</w:t>
-      </w:r>
-      <w:r>
-        <w:rPr>
-          <w:rFonts w:ascii="Calibri" w:hAnsi="Calibri" w:cs="Calibri"/>
-        </w:rPr>
-        <w:t>──</w:t>
-      </w:r>
-      <w:r>
-        <w:t xml:space="preserve"> ingress/</w:t>
-      </w:r>
-    </w:p>
-    <w:p>
-      <w:r>
-        <w:t xml:space="preserve">│   │   </w:t>
-      </w:r>
-      <w:r>
-        <w:rPr>
-          <w:rFonts w:ascii="Arial" w:hAnsi="Arial" w:cs="Arial"/>
-        </w:rPr>
-        <w:t>├</w:t>
-      </w:r>
-      <w:r>
-        <w:rPr>
-          <w:rFonts w:ascii="Calibri" w:hAnsi="Calibri" w:cs="Calibri"/>
-        </w:rPr>
-        <w:t>──</w:t>
-      </w:r>
-      <w:r>
-        <w:t xml:space="preserve"> cert-manager/</w:t>
-      </w:r>
-    </w:p>
-    <w:p>
-      <w:r>
-        <w:t>│   │</w:t>
+        <w:t>-projects/                   # RBAC &amp; boundaries</w:t>
       </w:r>
     </w:p>
     <w:p>
@@ -1173,69 +2323,15 @@
         <w:t>──</w:t>
       </w:r>
       <w:r>
-        <w:t xml:space="preserve"> operators/</w:t>
-      </w:r>
-    </w:p>
-    <w:p>
-      <w:r>
-        <w:t xml:space="preserve">│   │   </w:t>
-      </w:r>
-      <w:r>
-        <w:rPr>
-          <w:rFonts w:ascii="Arial" w:hAnsi="Arial" w:cs="Arial"/>
-        </w:rPr>
-        <w:t>├</w:t>
-      </w:r>
-      <w:r>
-        <w:rPr>
-          <w:rFonts w:ascii="Calibri" w:hAnsi="Calibri" w:cs="Calibri"/>
-        </w:rPr>
-        <w:t>──</w:t>
-      </w:r>
-      <w:r>
-        <w:t xml:space="preserve"> </w:t>
-      </w:r>
-      <w:proofErr w:type="spellStart"/>
-      <w:r>
-        <w:t>redis</w:t>
-      </w:r>
-      <w:proofErr w:type="spellEnd"/>
-      <w:r>
-        <w:t>-operator/</w:t>
-      </w:r>
-    </w:p>
-    <w:p>
-      <w:r>
-        <w:t xml:space="preserve">│   │   </w:t>
-      </w:r>
-      <w:r>
-        <w:rPr>
-          <w:rFonts w:ascii="Arial" w:hAnsi="Arial" w:cs="Arial"/>
-        </w:rPr>
-        <w:t>├</w:t>
-      </w:r>
-      <w:r>
-        <w:rPr>
-          <w:rFonts w:ascii="Calibri" w:hAnsi="Calibri" w:cs="Calibri"/>
-        </w:rPr>
-        <w:t>──</w:t>
-      </w:r>
-      <w:r>
-        <w:t xml:space="preserve"> </w:t>
-      </w:r>
-      <w:proofErr w:type="spellStart"/>
-      <w:r>
-        <w:t>postgres</w:t>
-      </w:r>
-      <w:proofErr w:type="spellEnd"/>
-      <w:r>
-        <w:t>-operator/</w:t>
-      </w:r>
-    </w:p>
-    <w:p>
-      <w:r>
-        <w:t>│   │</w:t>
-      </w:r>
+        <w:t xml:space="preserve"> </w:t>
+      </w:r>
+      <w:proofErr w:type="spellStart"/>
+      <w:proofErr w:type="gramStart"/>
+      <w:r>
+        <w:t>platform.yaml</w:t>
+      </w:r>
+      <w:proofErr w:type="spellEnd"/>
+      <w:proofErr w:type="gramEnd"/>
     </w:p>
     <w:p>
       <w:r>
@@ -1254,64 +2350,27 @@
         <w:t>──</w:t>
       </w:r>
       <w:r>
-        <w:t xml:space="preserve"> services/</w:t>
-      </w:r>
-    </w:p>
-    <w:p>
-      <w:r>
-        <w:t xml:space="preserve">│       </w:t>
-      </w:r>
-      <w:r>
-        <w:rPr>
-          <w:rFonts w:ascii="Arial" w:hAnsi="Arial" w:cs="Arial"/>
-        </w:rPr>
-        <w:t>├</w:t>
-      </w:r>
-      <w:r>
-        <w:rPr>
-          <w:rFonts w:ascii="Calibri" w:hAnsi="Calibri" w:cs="Calibri"/>
-        </w:rPr>
-        <w:t>──</w:t>
-      </w:r>
-      <w:r>
-        <w:t xml:space="preserve"> </w:t>
-      </w:r>
-      <w:proofErr w:type="spellStart"/>
-      <w:r>
-        <w:t>redis</w:t>
-      </w:r>
-      <w:proofErr w:type="spellEnd"/>
-      <w:r>
-        <w:t>/</w:t>
-      </w:r>
-    </w:p>
-    <w:p>
-      <w:r>
-        <w:t xml:space="preserve">│       </w:t>
-      </w:r>
-      <w:r>
-        <w:rPr>
-          <w:rFonts w:ascii="Arial" w:hAnsi="Arial" w:cs="Arial"/>
-        </w:rPr>
-        <w:t>├</w:t>
-      </w:r>
-      <w:r>
-        <w:rPr>
-          <w:rFonts w:ascii="Calibri" w:hAnsi="Calibri" w:cs="Calibri"/>
-        </w:rPr>
-        <w:t>──</w:t>
-      </w:r>
-      <w:r>
-        <w:t xml:space="preserve"> </w:t>
-      </w:r>
-      <w:proofErr w:type="spellStart"/>
-      <w:r>
-        <w:t>postgres</w:t>
-      </w:r>
-      <w:proofErr w:type="spellEnd"/>
-      <w:r>
-        <w:t>/</w:t>
-      </w:r>
+        <w:t xml:space="preserve"> </w:t>
+      </w:r>
+      <w:proofErr w:type="spellStart"/>
+      <w:proofErr w:type="gramStart"/>
+      <w:r>
+        <w:t>infrastructure.yaml</w:t>
+      </w:r>
+      <w:proofErr w:type="spellEnd"/>
+      <w:proofErr w:type="gramEnd"/>
+    </w:p>
+    <w:p>
+      <w:r>
+        <w:t xml:space="preserve">│   └── </w:t>
+      </w:r>
+      <w:proofErr w:type="spellStart"/>
+      <w:proofErr w:type="gramStart"/>
+      <w:r>
+        <w:t>applications.yaml</w:t>
+      </w:r>
+      <w:proofErr w:type="spellEnd"/>
+      <w:proofErr w:type="gramEnd"/>
     </w:p>
     <w:p>
       <w:r>
@@ -1320,183 +2379,7 @@
     </w:p>
     <w:p>
       <w:r>
-        <w:rPr>
-          <w:rFonts w:ascii="Arial" w:hAnsi="Arial" w:cs="Arial"/>
-        </w:rPr>
-        <w:t>├</w:t>
-      </w:r>
-      <w:r>
-        <w:rPr>
-          <w:rFonts w:ascii="Calibri" w:hAnsi="Calibri" w:cs="Calibri"/>
-        </w:rPr>
-        <w:t>──</w:t>
-      </w:r>
-      <w:r>
-        <w:t xml:space="preserve"> environments/</w:t>
-      </w:r>
-    </w:p>
-    <w:p>
-      <w:r>
-        <w:t xml:space="preserve">│   </w:t>
-      </w:r>
-      <w:r>
-        <w:rPr>
-          <w:rFonts w:ascii="Arial" w:hAnsi="Arial" w:cs="Arial"/>
-        </w:rPr>
-        <w:t>├</w:t>
-      </w:r>
-      <w:r>
-        <w:rPr>
-          <w:rFonts w:ascii="Calibri" w:hAnsi="Calibri" w:cs="Calibri"/>
-        </w:rPr>
-        <w:t>──</w:t>
-      </w:r>
-      <w:r>
-        <w:t xml:space="preserve"> dev/</w:t>
-      </w:r>
-    </w:p>
-    <w:p>
-      <w:r>
-        <w:t xml:space="preserve">│   │   </w:t>
-      </w:r>
-      <w:r>
-        <w:rPr>
-          <w:rFonts w:ascii="Arial" w:hAnsi="Arial" w:cs="Arial"/>
-        </w:rPr>
-        <w:t>├</w:t>
-      </w:r>
-      <w:r>
-        <w:rPr>
-          <w:rFonts w:ascii="Calibri" w:hAnsi="Calibri" w:cs="Calibri"/>
-        </w:rPr>
-        <w:t>──</w:t>
-      </w:r>
-      <w:r>
-        <w:t xml:space="preserve"> team-a/</w:t>
-      </w:r>
-    </w:p>
-    <w:p>
-      <w:r>
-        <w:t xml:space="preserve">│   │   │   </w:t>
-      </w:r>
-      <w:r>
-        <w:rPr>
-          <w:rFonts w:ascii="Arial" w:hAnsi="Arial" w:cs="Arial"/>
-        </w:rPr>
-        <w:t>├</w:t>
-      </w:r>
-      <w:r>
-        <w:rPr>
-          <w:rFonts w:ascii="Calibri" w:hAnsi="Calibri" w:cs="Calibri"/>
-        </w:rPr>
-        <w:t>──</w:t>
-      </w:r>
-      <w:r>
-        <w:t xml:space="preserve"> </w:t>
-      </w:r>
-      <w:proofErr w:type="spellStart"/>
-      <w:proofErr w:type="gramStart"/>
-      <w:r>
-        <w:t>redis.yaml</w:t>
-      </w:r>
-      <w:proofErr w:type="spellEnd"/>
-      <w:proofErr w:type="gramEnd"/>
-    </w:p>
-    <w:p>
-      <w:r>
-        <w:t xml:space="preserve">│   │   │   </w:t>
-      </w:r>
-      <w:r>
-        <w:rPr>
-          <w:rFonts w:ascii="Arial" w:hAnsi="Arial" w:cs="Arial"/>
-        </w:rPr>
-        <w:t>├</w:t>
-      </w:r>
-      <w:r>
-        <w:rPr>
-          <w:rFonts w:ascii="Calibri" w:hAnsi="Calibri" w:cs="Calibri"/>
-        </w:rPr>
-        <w:t>──</w:t>
-      </w:r>
-      <w:r>
-        <w:t xml:space="preserve"> </w:t>
-      </w:r>
-      <w:proofErr w:type="spellStart"/>
-      <w:proofErr w:type="gramStart"/>
-      <w:r>
-        <w:t>postgres.yaml</w:t>
-      </w:r>
-      <w:proofErr w:type="spellEnd"/>
-      <w:proofErr w:type="gramEnd"/>
-    </w:p>
-    <w:p>
-      <w:r>
-        <w:t>│   │   │</w:t>
-      </w:r>
-    </w:p>
-    <w:p>
-      <w:r>
-        <w:t xml:space="preserve">│   │   </w:t>
-      </w:r>
-      <w:r>
-        <w:rPr>
-          <w:rFonts w:ascii="Arial" w:hAnsi="Arial" w:cs="Arial"/>
-        </w:rPr>
-        <w:t>├</w:t>
-      </w:r>
-      <w:r>
-        <w:rPr>
-          <w:rFonts w:ascii="Calibri" w:hAnsi="Calibri" w:cs="Calibri"/>
-        </w:rPr>
-        <w:t>──</w:t>
-      </w:r>
-      <w:r>
-        <w:t xml:space="preserve"> team-b/</w:t>
-      </w:r>
-    </w:p>
-    <w:p>
-      <w:r>
-        <w:t>│   │</w:t>
-      </w:r>
-    </w:p>
-    <w:p>
-      <w:r>
-        <w:t xml:space="preserve">│   </w:t>
-      </w:r>
-      <w:r>
-        <w:rPr>
-          <w:rFonts w:ascii="Arial" w:hAnsi="Arial" w:cs="Arial"/>
-        </w:rPr>
-        <w:t>├</w:t>
-      </w:r>
-      <w:r>
-        <w:rPr>
-          <w:rFonts w:ascii="Calibri" w:hAnsi="Calibri" w:cs="Calibri"/>
-        </w:rPr>
-        <w:t>──</w:t>
-      </w:r>
-      <w:r>
-        <w:t xml:space="preserve"> stage/</w:t>
-      </w:r>
-    </w:p>
-    <w:p>
-      <w:r>
-        <w:t xml:space="preserve">│   </w:t>
-      </w:r>
-      <w:r>
-        <w:rPr>
-          <w:rFonts w:ascii="Arial" w:hAnsi="Arial" w:cs="Arial"/>
-        </w:rPr>
-        <w:t>├</w:t>
-      </w:r>
-      <w:r>
-        <w:rPr>
-          <w:rFonts w:ascii="Calibri" w:hAnsi="Calibri" w:cs="Calibri"/>
-        </w:rPr>
-        <w:t>──</w:t>
-      </w:r>
-      <w:r>
-        <w:t xml:space="preserve"> prod/</w:t>
+        <w:t>└── README.md</w:t>
       </w:r>
     </w:p>
     <w:p/>
@@ -1504,9 +2387,21 @@
     <w:p/>
     <w:p/>
     <w:p/>
-    <w:p>
-      <w:r>
-        <w:t>*) DB migration flyway structure:</w:t>
+    <w:p/>
+    <w:p/>
+    <w:p/>
+    <w:p>
+      <w:r>
+        <w:lastRenderedPageBreak/>
+        <w:t>*) DB migration flyway structure</w:t>
+      </w:r>
+      <w:r>
+        <w:t xml:space="preserve"> in each service</w:t>
+      </w:r>
+      <w:bookmarkStart w:id="0" w:name="_GoBack"/>
+      <w:bookmarkEnd w:id="0"/>
+      <w:r>
+        <w:t>:</w:t>
       </w:r>
       <w:r>
         <w:br/>

</xml_diff>